<commit_message>
New CV, new job
</commit_message>
<xml_diff>
--- a/Full_academic_CV_Norbert_Magyar.docx
+++ b/Full_academic_CV_Norbert_Magyar.docx
@@ -617,11 +617,11 @@
         <w:rPr>
           <w:color w:val="000000"/>
         </w:rPr>
-        <w:t>2024/12 –</w:t>
+        <w:t xml:space="preserve">2026/09 – </w:t>
         <w:tab/>
         <w:tab/>
         <w:tab/>
-        <w:t>Space Data Software Engineer</w:t>
+        <w:t>Space Data Solutions Architect</w:t>
       </w:r>
     </w:p>
     <w:p>
@@ -645,7 +645,7 @@
         <w:tab/>
         <w:tab/>
         <w:tab/>
-        <w:t>Starion Technologies N.V., Diegem, Belgium</w:t>
+        <w:t>Antwerp Space, Belgium</w:t>
       </w:r>
     </w:p>
     <w:p>
@@ -802,6 +802,88 @@
           <w:w w:val="102"/>
         </w:rPr>
         <w:t>S</w:t>
+      </w:r>
+    </w:p>
+    <w:p>
+      <w:pPr>
+        <w:pStyle w:val="Normal"/>
+        <w:widowControl w:val="false"/>
+        <w:ind w:hanging="357" w:left="357" w:right="-23"/>
+        <w:rPr>
+          <w:color w:val="000000"/>
+        </w:rPr>
+      </w:pPr>
+      <w:r>
+        <w:rPr/>
+      </w:r>
+    </w:p>
+    <w:p>
+      <w:pPr>
+        <w:pStyle w:val="Normal"/>
+        <w:widowControl w:val="false"/>
+        <w:tabs>
+          <w:tab w:val="clear" w:pos="720"/>
+          <w:tab w:val="left" w:pos="1418" w:leader="none"/>
+        </w:tabs>
+        <w:spacing w:before="13" w:after="0"/>
+        <w:ind w:hanging="1418" w:left="1418" w:right="-23"/>
+        <w:rPr>
+          <w:color w:val="000000"/>
+        </w:rPr>
+      </w:pPr>
+      <w:r>
+        <w:rPr>
+          <w:color w:val="000000"/>
+        </w:rPr>
+        <w:t xml:space="preserve">2024/12 – </w:t>
+      </w:r>
+      <w:r>
+        <w:rPr>
+          <w:color w:val="000000"/>
+        </w:rPr>
+        <w:t>2026/09</w:t>
+      </w:r>
+      <w:r>
+        <w:rPr>
+          <w:color w:val="000000"/>
+        </w:rPr>
+        <w:tab/>
+        <w:t>Space Data Software Engineer</w:t>
+      </w:r>
+    </w:p>
+    <w:p>
+      <w:pPr>
+        <w:pStyle w:val="Normal"/>
+        <w:widowControl w:val="false"/>
+        <w:tabs>
+          <w:tab w:val="clear" w:pos="720"/>
+          <w:tab w:val="left" w:pos="1418" w:leader="none"/>
+        </w:tabs>
+        <w:spacing w:before="13" w:after="0"/>
+        <w:ind w:hanging="1418" w:left="1418" w:right="-23"/>
+        <w:rPr>
+          <w:color w:val="000000"/>
+        </w:rPr>
+      </w:pPr>
+      <w:r>
+        <w:rPr>
+          <w:b/>
+          <w:bCs/>
+          <w:color w:val="000000"/>
+          <w:w w:val="102"/>
+        </w:rPr>
+        <w:tab/>
+        <w:tab/>
+        <w:tab/>
+      </w:r>
+      <w:r>
+        <w:rPr>
+          <w:b w:val="false"/>
+          <w:bCs w:val="false"/>
+          <w:color w:val="000000"/>
+          <w:w w:val="102"/>
+        </w:rPr>
+        <w:t>Starion Technologies N.V., Diegem, Belgium</w:t>
       </w:r>
     </w:p>
     <w:p>
@@ -3795,7 +3877,31 @@
       </w:pPr>
       <w:r>
         <w:rPr/>
-        <w:t>According to NASA/ADS, as of December 2025, I have co-authored 37 peer-reviewed publications, 15 of which as the PI or first author. Some other important metrics are the following:</w:t>
+        <w:t xml:space="preserve">According to NASA/ADS, as of </w:t>
+      </w:r>
+      <w:r>
+        <w:rPr/>
+        <w:t>October</w:t>
+      </w:r>
+      <w:r>
+        <w:rPr/>
+        <w:t xml:space="preserve"> 202</w:t>
+      </w:r>
+      <w:r>
+        <w:rPr/>
+        <w:t>6</w:t>
+      </w:r>
+      <w:r>
+        <w:rPr/>
+        <w:t>, I have co-authored 3</w:t>
+      </w:r>
+      <w:r>
+        <w:rPr/>
+        <w:t>9</w:t>
+      </w:r>
+      <w:r>
+        <w:rPr/>
+        <w:t xml:space="preserve"> peer-reviewed publications, 15 of which as the PI or first author. Some other important metrics are the following:</w:t>
       </w:r>
     </w:p>
     <w:p>
@@ -3810,7 +3916,23 @@
       </w:pPr>
       <w:r>
         <w:rPr/>
-        <w:t>1140 citations (363 for first-authored papers)</w:t>
+        <w:t>1</w:t>
+      </w:r>
+      <w:r>
+        <w:rPr/>
+        <w:t>256</w:t>
+      </w:r>
+      <w:r>
+        <w:rPr/>
+        <w:t xml:space="preserve"> citations (3</w:t>
+      </w:r>
+      <w:r>
+        <w:rPr/>
+        <w:t>95</w:t>
+      </w:r>
+      <w:r>
+        <w:rPr/>
+        <w:t xml:space="preserve"> for first-authored papers)</w:t>
       </w:r>
     </w:p>
     <w:p>
@@ -3825,7 +3947,23 @@
       </w:pPr>
       <w:r>
         <w:rPr/>
-        <w:t>H-Index of 18 (11 for first-authored papers)</w:t>
+        <w:t>H-Index of 1</w:t>
+      </w:r>
+      <w:r>
+        <w:rPr/>
+        <w:t>9</w:t>
+      </w:r>
+      <w:r>
+        <w:rPr/>
+        <w:t xml:space="preserve"> (1</w:t>
+      </w:r>
+      <w:r>
+        <w:rPr/>
+        <w:t>2</w:t>
+      </w:r>
+      <w:r>
+        <w:rPr/>
+        <w:t xml:space="preserve"> for first-authored papers)</w:t>
       </w:r>
     </w:p>
     <w:p>
@@ -4624,18 +4762,7 @@
         </w:rPr>
       </w:pPr>
       <w:r>
-        <w:rPr>
-          <w:b w:val="false"/>
-          <w:caps w:val="false"/>
-          <w:smallCaps w:val="false"/>
-          <w:strike w:val="false"/>
-          <w:dstrike w:val="false"/>
-          <w:color w:val="000000"/>
-          <w:spacing w:val="0"/>
-          <w:u w:val="none"/>
-          <w:effect w:val="none"/>
-          <w:shd w:fill="auto" w:val="clear"/>
-        </w:rPr>
+        <w:rPr/>
       </w:r>
     </w:p>
     <w:p>
@@ -4647,6 +4774,65 @@
         </w:numPr>
         <w:rPr/>
       </w:pPr>
+      <w:r>
+        <w:rPr/>
+        <w:t xml:space="preserve">Wyper, P. F., Squire, J., Pariat, E., Agapitov, O. V., Drake, J. F., </w:t>
+      </w:r>
+      <w:r>
+        <w:rPr>
+          <w:b/>
+          <w:bCs/>
+        </w:rPr>
+        <w:t>Magyar</w:t>
+      </w:r>
+      <w:r>
+        <w:rPr/>
+        <w:t xml:space="preserve">, N., Matthaeus, W. H., Matteini, L., Ruffolo, D., Réville, V., Shi, C., Shoda, M., Swisdak, M., Velli, M., Akhavan-Tafti, M., Gannouni, B., Lionello, R., Madjarska, M. S., Owens, </w:t>
+      </w:r>
+      <w:r>
+        <w:rPr/>
+        <w:t>M.</w:t>
+      </w:r>
+      <w:r>
+        <w:rPr/>
+        <w:t xml:space="preserve"> J., Raouafi, N. E., Sterling, A. C., Tripathi, D.; “</w:t>
+      </w:r>
+      <w:r>
+        <w:rPr>
+          <w:i/>
+          <w:iCs/>
+        </w:rPr>
+        <w:t>Magnetic Switchback Formation: A Review of Proposed Mechanisms</w:t>
+      </w:r>
+      <w:r>
+        <w:rPr/>
+        <w:t>”, Space Science Reviews, Volume 222, Issue 4, id.43, 2026.</w:t>
+      </w:r>
+    </w:p>
+    <w:p>
+      <w:pPr>
+        <w:pStyle w:val="BodyText"/>
+        <w:numPr>
+          <w:ilvl w:val="0"/>
+          <w:numId w:val="4"/>
+        </w:numPr>
+        <w:rPr/>
+      </w:pPr>
+      <w:r>
+        <w:rPr/>
+        <w:t xml:space="preserve">McMurdo, M., Van Doorsselaere, T., </w:t>
+      </w:r>
+      <w:r>
+        <w:rPr>
+          <w:b/>
+          <w:bCs/>
+        </w:rPr>
+        <w:t>Magyar</w:t>
+      </w:r>
+      <w:r>
+        <w:rPr/>
+        <w:t xml:space="preserve">, N., Banović, L., Lim, D.; </w:t>
+      </w:r>
       <w:r>
         <w:rPr>
           <w:b w:val="false"/>
@@ -4664,6 +4850,115 @@
           <w:effect w:val="none"/>
           <w:shd w:fill="auto" w:val="clear"/>
         </w:rPr>
+        <w:t>“</w:t>
+      </w:r>
+      <w:r>
+        <w:rPr>
+          <w:rFonts w:ascii="Times New Roman" w:hAnsi="Times New Roman"/>
+          <w:b w:val="false"/>
+          <w:i/>
+          <w:iCs/>
+          <w:caps w:val="false"/>
+          <w:smallCaps w:val="false"/>
+          <w:strike w:val="false"/>
+          <w:dstrike w:val="false"/>
+          <w:color w:val="000000"/>
+          <w:spacing w:val="0"/>
+          <w:sz w:val="24"/>
+          <w:szCs w:val="24"/>
+          <w:u w:val="none"/>
+          <w:effect w:val="none"/>
+          <w:shd w:fill="auto" w:val="clear"/>
+        </w:rPr>
+        <w:t>The Uniturbulence and Alfvén Wave Solar Model (UAWSoM) in MPI-AMRVAC</w:t>
+      </w:r>
+      <w:r>
+        <w:rPr>
+          <w:rFonts w:ascii="Helvetica Neue;Helvetica;Arial;sans-serif" w:hAnsi="Helvetica Neue;Helvetica;Arial;sans-serif"/>
+          <w:b w:val="false"/>
+          <w:i w:val="false"/>
+          <w:iCs w:val="false"/>
+          <w:caps w:val="false"/>
+          <w:smallCaps w:val="false"/>
+          <w:strike w:val="false"/>
+          <w:dstrike w:val="false"/>
+          <w:color w:val="000000"/>
+          <w:spacing w:val="0"/>
+          <w:sz w:val="24"/>
+          <w:szCs w:val="24"/>
+          <w:u w:val="none"/>
+          <w:effect w:val="none"/>
+          <w:shd w:fill="auto" w:val="clear"/>
+        </w:rPr>
+        <w:t xml:space="preserve">”, </w:t>
+      </w:r>
+      <w:r>
+        <w:rPr>
+          <w:rFonts w:ascii="Times New Roman" w:hAnsi="Times New Roman"/>
+          <w:b w:val="false"/>
+          <w:i w:val="false"/>
+          <w:iCs w:val="false"/>
+          <w:caps w:val="false"/>
+          <w:smallCaps w:val="false"/>
+          <w:strike w:val="false"/>
+          <w:dstrike w:val="false"/>
+          <w:color w:val="000000"/>
+          <w:spacing w:val="0"/>
+          <w:sz w:val="24"/>
+          <w:szCs w:val="24"/>
+          <w:u w:val="none"/>
+          <w:effect w:val="none"/>
+          <w:shd w:fill="auto" w:val="clear"/>
+        </w:rPr>
+        <w:t xml:space="preserve">Astronomy &amp; Astrophysics, Volume 705, id.A15, 13 pp., </w:t>
+      </w:r>
+      <w:r>
+        <w:rPr>
+          <w:rFonts w:ascii="Times New Roman" w:hAnsi="Times New Roman"/>
+          <w:b w:val="false"/>
+          <w:i w:val="false"/>
+          <w:iCs w:val="false"/>
+          <w:caps w:val="false"/>
+          <w:smallCaps w:val="false"/>
+          <w:strike w:val="false"/>
+          <w:dstrike w:val="false"/>
+          <w:color w:val="000000"/>
+          <w:spacing w:val="0"/>
+          <w:sz w:val="24"/>
+          <w:szCs w:val="24"/>
+          <w:u w:val="none"/>
+          <w:effect w:val="none"/>
+          <w:shd w:fill="auto" w:val="clear"/>
+        </w:rPr>
+        <w:t>2026.</w:t>
+      </w:r>
+    </w:p>
+    <w:p>
+      <w:pPr>
+        <w:pStyle w:val="BodyText"/>
+        <w:numPr>
+          <w:ilvl w:val="0"/>
+          <w:numId w:val="4"/>
+        </w:numPr>
+        <w:rPr/>
+      </w:pPr>
+      <w:r>
+        <w:rPr>
+          <w:b w:val="false"/>
+          <w:i w:val="false"/>
+          <w:iCs w:val="false"/>
+          <w:caps w:val="false"/>
+          <w:smallCaps w:val="false"/>
+          <w:strike w:val="false"/>
+          <w:dstrike w:val="false"/>
+          <w:color w:val="000000"/>
+          <w:spacing w:val="0"/>
+          <w:sz w:val="24"/>
+          <w:szCs w:val="24"/>
+          <w:u w:val="none"/>
+          <w:effect w:val="none"/>
+          <w:shd w:fill="auto" w:val="clear"/>
+        </w:rPr>
         <w:t xml:space="preserve">Van Doorsselaere, T., </w:t>
       </w:r>
       <w:r>
@@ -4677,7 +4972,34 @@
           <w:sz w:val="24"/>
           <w:szCs w:val="24"/>
         </w:rPr>
-        <w:t>Sieyra, M. V., Magyar, N., Goossens, M., Banović, L.;</w:t>
+        <w:t xml:space="preserve">Sieyra, M. V., </w:t>
+      </w:r>
+      <w:r>
+        <w:rPr>
+          <w:b/>
+          <w:bCs/>
+          <w:i w:val="false"/>
+          <w:caps w:val="false"/>
+          <w:smallCaps w:val="false"/>
+          <w:color w:val="000000"/>
+          <w:spacing w:val="0"/>
+          <w:sz w:val="24"/>
+          <w:szCs w:val="24"/>
+        </w:rPr>
+        <w:t>Magyar</w:t>
+      </w:r>
+      <w:r>
+        <w:rPr>
+          <w:b w:val="false"/>
+          <w:i w:val="false"/>
+          <w:caps w:val="false"/>
+          <w:smallCaps w:val="false"/>
+          <w:color w:val="000000"/>
+          <w:spacing w:val="0"/>
+          <w:sz w:val="24"/>
+          <w:szCs w:val="24"/>
+        </w:rPr>
+        <w:t>, N., Goossens, M., Banović, L.;</w:t>
       </w:r>
       <w:r>
         <w:rPr>
@@ -4747,7 +5069,7 @@
           <w:effect w:val="none"/>
           <w:shd w:fill="auto" w:val="clear"/>
         </w:rPr>
-        <w:t>”, Astronomy &amp; Astrophysics, Volume 696, id.A166, 18 pp., 2025</w:t>
+        <w:t>”, Astronomy &amp; Astrophysics, Volume 696, id.A166, 18 pp., 2025.</w:t>
       </w:r>
     </w:p>
     <w:p>
@@ -4870,7 +5192,7 @@
           <w:effect w:val="none"/>
           <w:shd w:fill="auto" w:val="clear"/>
         </w:rPr>
-        <w:t>”, The Astrophysical Journal, Volume 978, Issue 2, id.146, 12 pp., 2025</w:t>
+        <w:t>”, The Astrophysical Journal, Volume 978, Issue 2, id.146, 12 pp., 2025.</w:t>
       </w:r>
     </w:p>
     <w:p>
@@ -5392,7 +5714,7 @@
           <w:effect w:val="none"/>
           <w:shd w:fill="auto" w:val="clear"/>
         </w:rPr>
-        <w:t>”, The Astrophysical Journal, Volume 961, Issue 1, id.135, 13 pp., 2024</w:t>
+        <w:t>”, The Astrophysical Journal, Volume 961, Issue 1, id.135, 13 pp., 2024.</w:t>
       </w:r>
     </w:p>
     <w:p>

</xml_diff>